<commit_message>
Update colab notebook and submission doc
- Add drive remount step in run_colab.ipynb
- Update 2018 dataset experiment paths in run_colab.ipynb
- Update CDR 2026 Submission docx

Made-with: Cursor
</commit_message>
<xml_diff>
--- a/adversarial-rf-robustness/paper/Bellamy_CDR2026_Submission.docx
+++ b/adversarial-rf-robustness/paper/Bellamy_CDR2026_Submission.docx
@@ -230,7 +230,7 @@
         <w:t>Task complexity scaling.</w:t>
       </w:r>
       <w:r>
-        <w:t xml:space="preserve"> By evaluating on both RadioML 2016.10a (11 classes) and 2018.01a (24 classes), we demonstrate that adversarial vulnerability scales substantially with task complexity: attack success rates increase from 7–9% to 31–35% under identical perturbation constraints, with extreme per-class variation (from below 1% for simple modulations to above 99% for 256-QAM).</w:t>
+        <w:t xml:space="preserve"> By evaluating on both RadioML 2016.10a (11 classes) and 2018.01a (24 classes), we demonstrate that adversarial susceptibility scales substantially with task complexity: attack success rates increase from 7–9% to 31–35% under identical perturbation constraints, with extreme per-class variation (from below 1% for simple modulations to above 99% for 256-QAM).</w:t>
       </w:r>
     </w:p>
     <w:p>
@@ -761,7 +761,7 @@
         <w:t xml:space="preserve">Dataset limitations. </w:t>
       </w:r>
       <w:r>
-        <w:t>RadioML 2016.10a contains known generation artifacts, most notably an incorrect parameterization of the AM-SSB class that causes feature-space overlap with AM-DSB. This labeling inconsistency has been acknowledged by the dataset creators and may inflate measured vulnerability for affected classes. We retain 2016.10a because it remains the most widely used benchmark for comparability with prior adversarial RF studies, but we mitigate this concern by evaluating on RadioML 2018.01a in parallel, which corrects these generation artifacts and presents a substantially more challenging 24-class task. Where results diverge between datasets, we note the potential influence of 2016.10a artifacts.</w:t>
+        <w:t>RadioML 2016.10a contains known generation artifacts, most notably an incorrect parameterization of the AM-SSB class that causes feature-space overlap with AM-DSB. This labeling inconsistency has been acknowledged by the dataset creators and may inflate measured susceptibility for affected classes. We retain 2016.10a because it remains the most widely used benchmark for comparability with prior adversarial RF studies, but we mitigate this concern by evaluating on RadioML 2018.01a in parallel, which corrects these generation artifacts and presents a substantially more challenging 24-class task. Where results diverge between datasets, we note the potential influence of 2016.10a artifacts.</w:t>
       </w:r>
     </w:p>
     <w:p>
@@ -4975,7 +4975,7 @@
         <w:t xml:space="preserve">Evaluation methodology shapes threat assessment. </w:t>
       </w:r>
       <w:r>
-        <w:t>The double-noising artifact we identify has direct consequences for how military organizations assess adversarial risk. When AWGN is re-applied to RadioML samples that already contain noise at their labeled SNR, baseline accuracy degrades artificially, inflating reported ASR. Studies that do not account for this artifact may overestimate adversarial vulnerability, potentially misallocating defensive resources toward adversarial hardening when channel robustness is the more pressing need. We recommend that future evaluations using pre-collected benchmark datasets explicitly document how native noise is handled and report both absolute robust accuracy and marginal adversarial damage (the gap between clean and robust accuracy under identical channel conditions).</w:t>
+        <w:t>The double-noising artifact we identify has direct consequences for how military organizations assess adversarial risk. When AWGN is re-applied to RadioML samples that already contain noise at their labeled SNR, baseline accuracy degrades artificially, inflating reported ASR. Studies that do not account for this artifact may overestimate adversarial susceptibility, potentially misallocating defensive resources toward adversarial hardening when channel robustness is the more pressing need. We recommend that future evaluations using pre-collected benchmark datasets explicitly document how native noise is handled and report both absolute robust accuracy and marginal adversarial damage (the gap between clean and robust accuracy under identical channel conditions).</w:t>
       </w:r>
     </w:p>
     <w:p>
@@ -5003,7 +5003,7 @@
         <w:t xml:space="preserve">Task complexity is a critical risk multiplier. </w:t>
       </w:r>
       <w:r>
-        <w:t>The four-fold increase in ASR from the 11-class 2016 task (7–9%) to the 24-class 2018 task (31–35%) under identical perturbation constraints demonstrates that adversarial vulnerability does not remain constant as classification tasks grow more complex. Modern cognitive EW systems increasingly demand fine-grained waveform discrimination (distinguishing 64-QAM from 256-QAM, for example, or identifying specific emitter characteristics). Our results suggest that as these systems become more capable, they simultaneously become more vulnerable. This scaling relationship should inform system design: operators should expect adversarial robustness to degrade as classification granularity increases, and should plan defensive measures accordingly.</w:t>
+        <w:t>The four-fold increase in ASR from the 11-class 2016 task (7–9%) to the 24-class 2018 task (31–35%) under identical perturbation constraints demonstrates that adversarial susceptibility does not remain constant as classification tasks grow more complex. Modern cognitive EW systems increasingly demand fine-grained waveform discrimination (distinguishing 64-QAM from 256-QAM, for example, or identifying specific emitter characteristics). Our results suggest that as these systems become more capable, they simultaneously become more vulnerable. This scaling relationship should inform system design: operators should expect adversarial robustness to degrade as classification granularity increases, and should plan defensive measures accordingly.</w:t>
       </w:r>
     </w:p>
     <w:p>
@@ -5017,7 +5017,7 @@
         <w:t xml:space="preserve">Modulation-specific risk demands disaggregated assessment. </w:t>
       </w:r>
       <w:r>
-        <w:t>The per-class ASR variation from below 1% (OOK, BPSK) to 99.6% (256-QAM) means that a single aggregate robustness metric inadequately characterizes system vulnerability. In an operational context, a classifier that is impervious to adversarial attack for simple modulations but completely compromised for high-order QAM may still be operationally useful if the mission only requires detecting the presence of wideband signals, but it would be dangerously unreliable for tasks requiring precise modulation identification across the full constellation family. Risk assessments should disaggregate adversarial vulnerability by modulation class and weight the results by the operational importance of correctly classifying each waveform type.</w:t>
+        <w:t>The per-class ASR variation from below 1% (OOK, BPSK) to 99.6% (256-QAM) means that a single aggregate robustness metric inadequately characterizes system susceptibility. In an operational context, a classifier that is impervious to adversarial attack for simple modulations but completely compromised for high-order QAM may still be operationally useful if the mission only requires detecting the presence of wideband signals, but it would be dangerously unreliable for tasks requiring precise modulation identification across the full constellation family. Risk assessments should disaggregate adversarial susceptibility by modulation class and weight the results by the operational importance of correctly classifying each waveform type.</w:t>
       </w:r>
     </w:p>
     <w:p>
@@ -5131,7 +5131,7 @@
         <w:t xml:space="preserve">Dataset limitations. </w:t>
       </w:r>
       <w:r>
-        <w:t>The absence of transferability evaluation on RadioML 2018.01a is a gap in our analysis; the higher baseline vulnerability of the 2018 classifier (31% ASR vs. 7% on 2016) may produce different transfer dynamics. Additionally, RadioML 2016.10a contains the known AM-SSB encoding artifact where the AM-SSB class is generated with incorrect parameters, which may inflate AM-DSB’s measured vulnerability (41.76% ASR) if adversarial perturbations exploit the resulting overlap in feature space. Our 2018 results are not affected by this artifact.</w:t>
+        <w:t>The absence of transferability evaluation on RadioML 2018.01a is a gap in our analysis; the higher baseline susceptibility of the 2018 classifier (31% ASR vs. 7% on 2016) may produce different transfer dynamics. Additionally, RadioML 2016.10a contains the known AM-SSB encoding artifact where the AM-SSB class is generated with incorrect parameters, which may inflate AM-DSB’s measured susceptibility (41.76% ASR) if adversarial perturbations exploit the resulting overlap in feature space. Our 2018 results are not affected by this artifact.</w:t>
       </w:r>
     </w:p>
     <w:p>
@@ -5189,7 +5189,7 @@
         <w:t xml:space="preserve">Transferability on complex tasks. </w:t>
       </w:r>
       <w:r>
-        <w:t>Our transferability analysis is limited to RadioML 2016.10a. Given that the 2018 classifier exhibits fundamentally different vulnerability characteristics (four-fold higher ASR, steeper budget sensitivity), transfer dynamics on 2018 may differ substantially. The higher-dimensional decision boundary geometry of the 24-class task could either increase transfer rates (more decision boundaries to cross) or decrease them (more diverse learned representations across defense strategies).</w:t>
+        <w:t>Our transferability analysis is limited to RadioML 2016.10a. Given that the 2018 classifier exhibits fundamentally different susceptibility characteristics (four-fold higher ASR, steeper budget sensitivity), transfer dynamics on 2018 may differ substantially. The higher-dimensional decision boundary geometry of the 24-class task could either increase transfer rates (more decision boundaries to cross) or decrease them (more diverse learned representations across defense strategies).</w:t>
       </w:r>
     </w:p>
     <w:p>
@@ -5388,7 +5388,7 @@
         <w:ind w:left="720" w:hanging="720"/>
       </w:pPr>
       <w:r>
-        <w:t>Bahramali, Alireza, Milad Nasr, Amir Houmansadr, Dennis Goeckel, and Don Towsley. 2021. “Robust Adversarial Attacks Against DNN-Based Wireless Communication Systems.” In Proceedings of the 2021 ACM SIGSAC Conference on Computer and Communications Security (CCS ’21), 126–140. ACM.</w:t>
+        <w:t>Bahramali, Alireza, Milad Nasr, Amir Houmansadr, Dennis Goeckel, and Don Towsley. 2021. “Robust Adversarial Attacks Against DNN-Based Wireless Communication Systems.” In Proceedings of the 2021 ACM SIGSAC Conference on Computer and Communications Security (CCS ’21), 126–140. ACM. https://doi.org/10.1145/3460120.3484777.</w:t>
       </w:r>
     </w:p>
     <w:p>
@@ -5397,7 +5397,7 @@
         <w:ind w:left="720" w:hanging="720"/>
       </w:pPr>
       <w:r>
-        <w:t>Chen, Yantao, Binhong Dong, Cuiting Liu, Wenhui Xiong, and Shaoqian Li. 2023. “Abandon Locality: Frame-Wise Embedding Aided Transformer for Automatic Modulation Recognition.” IEEE Communications Letters 27 (1): 327–331.</w:t>
+        <w:t>Chen, Yantao, Binhong Dong, Cuiting Liu, Wenhui Xiong, and Shaoqian Li. 2023. “Abandon Locality: Frame-Wise Embedding Aided Transformer for Automatic Modulation Recognition.” IEEE Communications Letters 27 (1): 327–331. https://doi.org/10.1109/LCOMM.2022.3213523.</w:t>
       </w:r>
     </w:p>
     <w:p>
@@ -5406,7 +5406,7 @@
         <w:ind w:left="720" w:hanging="720"/>
       </w:pPr>
       <w:r>
-        <w:t>Carlini, Nicholas, and David Wagner. 2017. “Towards Evaluating the Robustness of Neural Networks.” In 2017 IEEE Symposium on Security and Privacy (SP), 39–57. IEEE.</w:t>
+        <w:t>Carlini, Nicholas, and David Wagner. 2017. “Towards Evaluating the Robustness of Neural Networks.” In 2017 IEEE Symposium on Security and Privacy (SP), 39–57. IEEE. https://doi.org/10.1109/SP.2017.49.</w:t>
       </w:r>
     </w:p>
     <w:p>
@@ -5415,7 +5415,7 @@
         <w:ind w:left="720" w:hanging="720"/>
       </w:pPr>
       <w:r>
-        <w:t>Cohen, Jeremy M., Elan Rosenfeld, and J. Zico Kolter. 2019. “Certified Adversarial Robustness via Randomized Smoothing.” In International Conference on Machine Learning (ICML), 1310–1320.</w:t>
+        <w:t>Cohen, Jeremy M., Elan Rosenfeld, and J. Zico Kolter. 2019. “Certified Adversarial Robustness via Randomized Smoothing.” In International Conference on Machine Learning (ICML), 1310–1320. PMLR.</w:t>
       </w:r>
     </w:p>
     <w:p>
@@ -5433,7 +5433,7 @@
         <w:ind w:left="720" w:hanging="720"/>
       </w:pPr>
       <w:r>
-        <w:t>Ke, Da, Shen Wang, and Lianfen Huang. 2024. “Frequency-Selective Adversarial Attack Against Deep Learning-Based Wireless Signal Classifiers.” IEEE Transactions on Information Forensics and Security 19: 4001–4011.</w:t>
+        <w:t>Ke, Da, Shen Wang, and Lianfen Huang. 2024. “Frequency-Selective Adversarial Attack Against Deep Learning-Based Wireless Signal Classifiers.” IEEE Transactions on Information Forensics and Security 19: 4001–4011. https://doi.org/10.1109/TIFS.2023.3345138.</w:t>
       </w:r>
     </w:p>
     <w:p>
@@ -5442,7 +5442,7 @@
         <w:ind w:left="720" w:hanging="720"/>
       </w:pPr>
       <w:r>
-        <w:t>Lu, Hui, Ruoliu Zhang, Shiqi Wang, and Yuhui Shi. 2025. “Robustness Assessment of DL-Based Automatic Modulation Classification Model via Channel-Aware Adversarial Perturbation.” IEEE Transactions on Cognitive Communications and Networking (early access).</w:t>
+        <w:t>Lu, Hui, Ruoliu Zhang, Shiqi Wang, and Yuhui Shi. 2025. “Robustness Assessment of DL-Based Automatic Modulation Classification Model via Channel-Aware Adversarial Perturbation.” IEEE Transactions on Cognitive Communications and Networking (early access). https://doi.org/10.1109/TCCN.2025.3556783.</w:t>
       </w:r>
     </w:p>
     <w:p>
@@ -5451,7 +5451,7 @@
         <w:ind w:left="720" w:hanging="720"/>
       </w:pPr>
       <w:r>
-        <w:t>Flowers, Bryse, R. Michael Buehrer, and William C. Headley. 2019. “Evaluating Adversarial Evasion Attacks in the Context of Wireless Communications.” IEEE Transactions on Information Forensics and Security 15: 1102–1113.</w:t>
+        <w:t>Flowers, Bryse, R. Michael Buehrer, and William C. Headley. 2019. “Evaluating Adversarial Evasion Attacks in the Context of Wireless Communications.” IEEE Transactions on Information Forensics and Security 15: 1102–1113. https://doi.org/10.1109/TIFS.2019.2934069.</w:t>
       </w:r>
     </w:p>
     <w:p>
@@ -5460,7 +5460,7 @@
         <w:ind w:left="720" w:hanging="720"/>
       </w:pPr>
       <w:r>
-        <w:t>Goodfellow, Ian J., Jonathon Shlens, and Christian Szegedy. 2015. “Explaining and Harnessing Adversarial Examples.” arXiv preprint arXiv:1412.6572.</w:t>
+        <w:t>Goodfellow, Ian J., Jonathon Shlens, and Christian Szegedy. 2015. “Explaining and Harnessing Adversarial Examples.” arXiv preprint arXiv:1412.6572. https://doi.org/10.48550/arXiv.1412.6572.</w:t>
       </w:r>
     </w:p>
     <w:p>
@@ -5478,7 +5478,7 @@
         <w:ind w:left="720" w:hanging="720"/>
       </w:pPr>
       <w:r>
-        <w:t>Hameed, Muhammad Zaid, Andras Gyorgy, and Deniz Gunduz. 2021. “The Best Defense Is a Good Offense: Adversarial Attacks to Avoid Modulation Detection.” IEEE Transactions on Information Forensics and Security 16: 1074–1087.</w:t>
+        <w:t>Hameed, Muhammad Zaid, Andras Gyorgy, and Deniz Gunduz. 2021. “The Best Defense Is a Good Offense: Adversarial Attacks to Avoid Modulation Detection.” IEEE Transactions on Information Forensics and Security 16: 1074–1087. https://doi.org/10.1109/TIFS.2020.3023439.</w:t>
       </w:r>
     </w:p>
     <w:p>
@@ -5487,7 +5487,7 @@
         <w:ind w:left="720" w:hanging="720"/>
       </w:pPr>
       <w:r>
-        <w:t>Kim, Brian, Yalin Evren Sagduyu, Kemal Davaslioglu, Tugba Erpek, and Sennur Ulukus. 2022. “Channel-Aware Adversarial Attacks Against Deep Learning-Based Wireless Signal Classifiers.” IEEE Transactions on Wireless Communications 21 (6): 3868–3880.</w:t>
+        <w:t>Kim, Brian, Yalin Evren Sagduyu, Kemal Davaslioglu, Tugba Erpek, and Sennur Ulukus. 2022. “Channel-Aware Adversarial Attacks Against Deep Learning-Based Wireless Signal Classifiers.” IEEE Transactions on Wireless Communications 21 (6): 3868–3880. https://doi.org/10.1109/TWC.2021.3124855.</w:t>
       </w:r>
     </w:p>
     <w:p>
@@ -5496,7 +5496,7 @@
         <w:ind w:left="720" w:hanging="720"/>
       </w:pPr>
       <w:r>
-        <w:t>Lin, Yun, Haojun Zhao, Ya Tu, Siming Mao, and Zhida Dou. 2020. “Threats of Adversarial Attacks in DNN-Based Modulation Recognition.” In IEEE INFOCOM 2020, 2469–2478. IEEE.</w:t>
+        <w:t>Lin, Yun, Haojun Zhao, Ya Tu, Siming Mao, and Zhida Dou. 2020. “Threats of Adversarial Attacks in DNN-Based Modulation Recognition.” In IEEE INFOCOM 2020, 2469–2478. IEEE. https://doi.org/10.1109/INFOCOM41043.2020.9155389.</w:t>
       </w:r>
     </w:p>
     <w:p>
@@ -5505,7 +5505,7 @@
         <w:ind w:left="720" w:hanging="720"/>
       </w:pPr>
       <w:r>
-        <w:t>Liu, Xiaoyu, Diyu Yang, and Aly El Gamal. 2017. “Deep Neural Network Architectures for Modulation Classification.” In 2017 51st Asilomar Conference on Signals, Systems, and Computers, 915–919. IEEE.</w:t>
+        <w:t>Liu, Xiaoyu, Diyu Yang, and Aly El Gamal. 2017. “Deep Neural Network Architectures for Modulation Classification.” In 2017 51st Asilomar Conference on Signals, Systems, and Computers, 915–919. IEEE. https://doi.org/10.1109/ACSSC.2017.8335483.</w:t>
       </w:r>
     </w:p>
     <w:p>
@@ -5514,7 +5514,7 @@
         <w:ind w:left="720" w:hanging="720"/>
       </w:pPr>
       <w:r>
-        <w:t>Madry, Aleksander, Aleksandar Makelov, Ludwig Schmidt, Dimitris Tsipras, and Adrian Vladu. 2018. “Towards Deep Learning Models Resistant to Adversarial Attacks.” In International Conference on Learning Representations (ICLR).</w:t>
+        <w:t>Madry, Aleksander, Aleksandar Makelov, Ludwig Schmidt, Dimitris Tsipras, and Adrian Vladu. 2018. “Towards Deep Learning Models Resistant to Adversarial Attacks.” In International Conference on Learning Representations (ICLR). https://arxiv.org/abs/1706.06083.</w:t>
       </w:r>
     </w:p>
     <w:p>
@@ -5523,7 +5523,7 @@
         <w:ind w:left="720" w:hanging="720"/>
       </w:pPr>
       <w:r>
-        <w:t>O’Shea, Timothy James, Johnathan Corgan, and T. Charles Clancy. 2016. “Convolutional Radio Modulation Recognition Networks.” In Engineering Applications of Neural Networks: 17th International Conference, EANN 2016, 213–226. Springer.</w:t>
+        <w:t>O’Shea, Timothy James, Johnathan Corgan, and T. Charles Clancy. 2016. “Convolutional Radio Modulation Recognition Networks.” In Engineering Applications of Neural Networks: 17th International Conference, EANN 2016, 213–226. Springer. https://doi.org/10.1007/978-3-319-44188-7_16.</w:t>
       </w:r>
     </w:p>
     <w:p>
@@ -5532,7 +5532,7 @@
         <w:ind w:left="720" w:hanging="720"/>
       </w:pPr>
       <w:r>
-        <w:t>Perenda, Electra, Gerome Bovet, Marija Zheleva, and Sofie Pollin. 2024. “Channel and Hardware Impairment Data Augmentation for Robust Modulation Classification.” IEEE Transactions on Cognitive Communications and Networking 10 (4): 1263–1279.</w:t>
+        <w:t>Perenda, Electra, Gerome Bovet, Marija Zheleva, and Sofie Pollin. 2024. “Channel and Hardware Impairment Data Augmentation for Robust Modulation Classification.” IEEE Transactions on Cognitive Communications and Networking 10 (4): 1263–1279. https://doi.org/10.1109/TCCN.2024.3379379.</w:t>
       </w:r>
     </w:p>
     <w:p>
@@ -5541,7 +5541,7 @@
         <w:ind w:left="720" w:hanging="720"/>
       </w:pPr>
       <w:r>
-        <w:t>O’Shea, Timothy James, Tamoghna Roy, and T. Charles Clancy. 2018. “Over-the-Air Deep Learning Based Radio Signal Classification.” IEEE Journal of Selected Topics in Signal Processing 12 (1): 168–179.</w:t>
+        <w:t>O’Shea, Timothy James, Tamoghna Roy, and T. Charles Clancy. 2018. “Over-the-Air Deep Learning Based Radio Signal Classification.” IEEE Journal of Selected Topics in Signal Processing 12 (1): 168–179. https://doi.org/10.1109/JSTSP.2018.2797022.</w:t>
       </w:r>
     </w:p>
     <w:p>
@@ -5550,7 +5550,7 @@
         <w:ind w:left="720" w:hanging="720"/>
       </w:pPr>
       <w:r>
-        <w:t>Rajendran, Sreeraj, Wannes Meert, Domenico Giustiniano, Vincent Lenders, and Sofie Pollin. 2018. “Deep Learning Models for Wireless Signal Classification with Distributed Low-Cost Spectrum Sensors.” IEEE Transactions on Cognitive Communications and Networking 4 (3): 433–445.</w:t>
+        <w:t>Rajendran, Sreeraj, Wannes Meert, Domenico Giustiniano, Vincent Lenders, and Sofie Pollin. 2018. “Deep Learning Models for Wireless Signal Classification with Distributed Low-Cost Spectrum Sensors.” IEEE Transactions on Cognitive Communications and Networking 4 (3): 433–445. https://doi.org/10.1109/TCCN.2018.2835460.</w:t>
       </w:r>
     </w:p>
     <w:p>
@@ -5559,7 +5559,7 @@
         <w:ind w:left="720" w:hanging="720"/>
       </w:pPr>
       <w:r>
-        <w:t>Qu, Yunpeng, Zhilin Lu, Rui Zeng, Jintao Wang, and Jian Wang. 2025. “Enhancing Automatic Modulation Recognition Through Robust Global Feature Extraction.” IEEE Transactions on Vehicular Technology 74 (3): 4192–4207.</w:t>
+        <w:t>Qu, Yunpeng, Zhilin Lu, Rui Zeng, Jintao Wang, and Jian Wang. 2025. “Enhancing Automatic Modulation Recognition Through Robust Global Feature Extraction.” IEEE Transactions on Vehicular Technology 74 (3): 4192–4207. https://doi.org/10.1109/TVT.2024.3486079.</w:t>
       </w:r>
     </w:p>
     <w:p>
@@ -5577,7 +5577,7 @@
         <w:ind w:left="720" w:hanging="720"/>
       </w:pPr>
       <w:r>
-        <w:t>Restuccia, Francesco, Salvatore D’Oro, Amani Al-Shawabka, Michele Belgiovine, Luca Angioloni, Stratis Ioannidis, Kaushik Chowdhury, and Tommaso Melodia. 2019. “DeepRadioID: Real-Time Channel-Resilient Optimization of Deep Learning-Based Radio Fingerprinting Algorithms.” In Proceedings of the Twentieth ACM International Symposium on Mobile Ad Hoc Networking and Computing (MobiHoc ’19). ACM.</w:t>
+        <w:t>Restuccia, Francesco, Salvatore D’Oro, Amani Al-Shawabka, Michele Belgiovine, Luca Angioloni, Stratis Ioannidis, Kaushik Chowdhury, and Tommaso Melodia. 2019. “DeepRadioID: Real-Time Channel-Resilient Optimization of Deep Learning-Based Radio Fingerprinting Algorithms.” In Proceedings of the Twentieth ACM International Symposium on Mobile Ad Hoc Networking and Computing (MobiHoc ’19). ACM. https://doi.org/10.1145/3323679.3326503.</w:t>
       </w:r>
     </w:p>
     <w:p>
@@ -5586,7 +5586,7 @@
         <w:ind w:left="720" w:hanging="720"/>
       </w:pPr>
       <w:r>
-        <w:t>Sadeghi, Meysam, and Erik G. Larsson. 2018. “Adversarial Attacks on Deep-Learning Based Radio Signal Classification.” In 2018 IEEE International Workshop on Signal Processing Advances in Wireless Communications (SPAWC), 1–5. IEEE.</w:t>
+        <w:t>Sadeghi, Meysam, and Erik G. Larsson. 2018. “Adversarial Attacks on Deep-Learning Based Radio Signal Classification.” In 2018 IEEE International Workshop on Signal Processing Advances in Wireless Communications (SPAWC), 1–5. IEEE. https://doi.org/10.1109/SPAWC.2018.8445985.</w:t>
       </w:r>
     </w:p>
     <w:p>
@@ -5595,7 +5595,7 @@
         <w:ind w:left="720" w:hanging="720"/>
       </w:pPr>
       <w:r>
-        <w:t>Sagduyu, Yalin E., Yi Shi, and Tugba Erpek. 2019. “Adversarial Deep Learning for Over-the-Air Spectrum Poisoning Attacks.” IEEE Transactions on Mobile Computing 20 (2): 306–319.</w:t>
+        <w:t>Sagduyu, Yalin E., Yi Shi, and Tugba Erpek. 2019. “Adversarial Deep Learning for Over-the-Air Spectrum Poisoning Attacks.” IEEE Transactions on Mobile Computing 20 (2): 306–319. https://doi.org/10.1109/TMC.2019.2950398.</w:t>
       </w:r>
     </w:p>
     <w:p>
@@ -5604,7 +5604,7 @@
         <w:ind w:left="720" w:hanging="720"/>
       </w:pPr>
       <w:r>
-        <w:t>Salman, Hadi, Jerry Li, Ilya Razenshteyn, Pengchuan Zhang, Huan Zhang, Sebastien Bubeck, and Greg Yang. 2019. “Provably Robust Deep Learning via Adversarially Trained Smoothed Classifiers.” In Advances in Neural Information Processing Systems (NeurIPS) 32.</w:t>
+        <w:t>Salman, Hadi, Jerry Li, Ilya Razenshteyn, Pengchuan Zhang, Huan Zhang, Sebastien Bubeck, and Greg Yang. 2019. “Provably Robust Deep Learning via Adversarially Trained Smoothed Classifiers.” In Advances in Neural Information Processing Systems (NeurIPS) 32. https://arxiv.org/abs/1906.04584.</w:t>
       </w:r>
     </w:p>
     <w:p>
@@ -5613,7 +5613,7 @@
         <w:ind w:left="720" w:hanging="720"/>
       </w:pPr>
       <w:r>
-        <w:t>Shafahi, Ali, Mahyar Najibi, Mohammad Amin Ghiasi, Zheng Xu, John Dickerson, Christoph Studer, Larry S. Davis, Gavin Taylor, and Tom Goldstein. 2019. “Adversarial Training for Free!” In Advances in Neural Information Processing Systems (NeurIPS) 32.</w:t>
+        <w:t>Shafahi, Ali, Mahyar Najibi, Mohammad Amin Ghiasi, Zheng Xu, John Dickerson, Christoph Studer, Larry S. Davis, Gavin Taylor, and Tom Goldstein. 2019. “Adversarial Training for Free!” In Advances in Neural Information Processing Systems (NeurIPS) 32. https://arxiv.org/abs/1904.12843.</w:t>
       </w:r>
     </w:p>
     <w:p>
@@ -5631,7 +5631,7 @@
         <w:ind w:left="720" w:hanging="720"/>
       </w:pPr>
       <w:r>
-        <w:t>West, Nathan E., and Timothy O’Shea. 2017. “Deep Architectures for Modulation Recognition.” In 2017 IEEE International Symposium on Dynamic Spectrum Access Networks (DySPAN), 1–6. IEEE.</w:t>
+        <w:t>West, Nathan E., and Timothy O’Shea. 2017. “Deep Architectures for Modulation Recognition.” In 2017 IEEE International Symposium on Dynamic Spectrum Access Networks (DySPAN), 1–6. IEEE. https://doi.org/10.1109/DySPAN.2017.7920754.</w:t>
       </w:r>
     </w:p>
     <w:sectPr>

</xml_diff>